<commit_message>
Make the housing allowance clause optional, drop the 25% wording
- Article 13 clause 1 is now {{housing_clause}} / {{housing_clause_en}} in all
  three templates; the old templates lose "بنسبة (25%)" / "of (25%)" and use
  the reference wording
- without the clause the item reads "لايوجد" / "NONE" like items 2 and 3
- housing=1 (default) | 0 | auto (employee's "housing included" flag); a
  checkbox on the single contract, a 3-way choice in multiple contracts,
  recorded in the batch audit entry

Co-Authored-By: Claude Opus 5.5 <noreply@anthropic.com>
</commit_message>
<xml_diff>
--- a/templates_docs/contract_reference.docx
+++ b/templates_docs/contract_reference.docx
@@ -5203,7 +5203,7 @@
                 <w:rtl/>
                 <w:lang w:bidi="ar-KW"/>
               </w:rPr>
-              <w:t>يتضمن</w:t>
+              <w:t>{{housing_clause}}</w:t>
             </w:r>
             <w:proofErr w:type="gramEnd"/>
             <w:r>
@@ -5213,7 +5213,6 @@
                 <w:rtl/>
                 <w:lang w:bidi="ar-KW"/>
               </w:rPr>
-              <w:t xml:space="preserve"> الأجر الشهري المنصوص عليه في البند الرابع من هذا العقد بدل </w:t>
             </w:r>
             <w:proofErr w:type="gramStart"/>
             <w:r>
@@ -5223,7 +5222,6 @@
                 <w:rtl/>
                 <w:lang w:bidi="ar-KW"/>
               </w:rPr>
-              <w:t xml:space="preserve">سكن </w:t>
             </w:r>
             <w:r>
               <w:rPr>
@@ -5233,7 +5231,6 @@
                 <w:rtl/>
                 <w:lang w:bidi="ar-KW"/>
               </w:rPr>
-              <w:t>.</w:t>
             </w:r>
             <w:proofErr w:type="gramEnd"/>
           </w:p>
@@ -6587,7 +6584,7 @@
                 <w:szCs w:val="12"/>
                 <w:lang w:bidi="ar-KW"/>
               </w:rPr>
-              <w:t>The monthly remuneration provided for in Clause Four of this contract includes a housing allowance</w:t>
+              <w:t>{{housing_clause_en}}</w:t>
             </w:r>
             <w:r>
               <w:rPr>
@@ -6595,7 +6592,6 @@
                 <w:szCs w:val="12"/>
                 <w:lang w:bidi="ar-KW"/>
               </w:rPr>
-              <w:t>.</w:t>
             </w:r>
           </w:p>
           <w:p>

</xml_diff>

<commit_message>
Bring back signatory and employee signatures on contracts
The contract template gets {{sig_first_party}} / {{sig_second_party}} in
the first empty line under each party, as the previous template had, so
the "بتوقيع المفوّض" / "بتوقيع الموظف" checkboxes appear again when
printing single and batch contracts. Contracts stay two pages with both
signatures.

The contract.sign permission is renamed to "توقيعات المفوّضين والموظفين".

Co-Authored-By: Claude Opus 5.5 <noreply@anthropic.com>
</commit_message>
<xml_diff>
--- a/templates_docs/contract_reference.docx
+++ b/templates_docs/contract_reference.docx
@@ -6316,6 +6316,9 @@
                 <w:lang w:bidi="ar-KW"/>
               </w:rPr>
             </w:pPr>
+            <w:r>
+              <w:t>{{sig_first_party}}</w:t>
+            </w:r>
           </w:p>
           <w:p>
             <w:pPr>
@@ -6408,6 +6411,9 @@
                 <w:lang w:bidi="ar-KW"/>
               </w:rPr>
             </w:pPr>
+            <w:r>
+              <w:t>{{sig_second_party}}</w:t>
+            </w:r>
           </w:p>
         </w:tc>
       </w:tr>

</xml_diff>